<commit_message>
BrainScroll: fix canonical question counts at 3 / 5 / 7 / 10
- LEARNING_STRUCTURE: replace the questions.target range with a single
  questions.standard (regular 3, checkpoint 5, milestone 7, mastery 10) and
  export STANDARD_QUESTIONS. Milestone drafting tolerance narrows to 6-8.
- Validator: a published level must match the standard exactly; drafts that
  differ get a warning.
- Remove the remaining "5-7" / "~5" / "~10" question-count language from docs,
  CLAUDE.md, migration comments and the source .docx specs.
- Tests cover the canonical counts and the Level 50 milestone at 7.

Co-Authored-By: Claude Opus 5.5 <noreply@anthropic.com>
Claude-Session: https://claude.ai/code/session_01EwSpp1ySrzExTB2LA7xjCv
</commit_message>
<xml_diff>
--- a/brainscroll/docs/source/Build_Order_Blueprint.docx
+++ b/brainscroll/docs/source/Build_Order_Blueprint.docx
@@ -2298,7 +2298,7 @@
           <w:rFonts w:ascii="Aptos" w:hAnsi="Aptos"/>
           <w:sz w:val="21"/>
         </w:rPr>
-        <w:t>A level is a small learning encounter: mostly short reading/visual cards, then about 3 light questions (recall, understanding, connection)—not a single trivia fact and not a test. Question count is set by level type: regular 3; every 10th-level checkpoint about 5; the Level 50 milestone 5–7; the Level 100 Mastery Challenge about 10; review sessions vary with what is due.</w:t>
+        <w:t xml:space="preserve">A level is a small learning encounter: mostly short reading/visual cards, then 3 light questions (recall, understanding, connection)—not a single trivia fact and not a test. Question count is fixed by level type: regular 3; every 10th-level checkpoint 5; the Level 50 milestone 7; the Level 100 Mastery Challenge 10; review sessions vary with what is due.</w:t>
       </w:r>
     </w:p>
     <w:p>
@@ -4715,7 +4715,7 @@
           <w:rFonts w:ascii="Aptos" w:hAnsi="Aptos"/>
           <w:sz w:val="21"/>
         </w:rPr>
-        <w:t>Enough variety that Levels 1–10 do not feel like ten copies of the same template. Levels 1–9 are regular levels (3 questions each); Level 10 is the first checkpoint (about 5).</w:t>
+        <w:t>Enough variety that Levels 1–10 do not feel like ten copies of the same template. Levels 1–9 are regular levels (3 questions each); Level 10 is the first checkpoint (5 questions).</w:t>
       </w:r>
     </w:p>
     <w:p>

</xml_diff>

<commit_message>
BrainScroll docs: fix structural OOXML errors in the source .docx specs
Structural only; text, content and design are unchanged. All four files now
pass the OOXML validator cleanly.

- Reorder table-cell, row and paragraph property elements into schema order
  (e.g. tcBorders before shd).
- Give fill-only shading its required w:val="clear" (no pattern, same fill).
- Remove byte-identical duplicate property elements (33 keepNext in the
  Roadmap headings, 67 cantSplit in the Visual Direction tables).
- Add the required w:percent="100" to the document zoom setting.

Most of these were present in the originally uploaded files.

Co-Authored-By: Claude Opus 5.5 <noreply@anthropic.com>
Claude-Session: https://claude.ai/code/session_01EwSpp1ySrzExTB2LA7xjCv
</commit_message>
<xml_diff>
--- a/brainscroll/docs/source/Build_Order_Blueprint.docx
+++ b/brainscroll/docs/source/Build_Order_Blueprint.docx
@@ -16,7 +16,7 @@
         <w:tc>
           <w:tcPr>
             <w:tcW w:type="dxa" w:w="10080"/>
-            <w:shd w:fill="132238"/>
+            <w:shd w:fill="132238" w:val="clear"/>
             <w:tcMar>
               <w:top w:w="70" w:type="dxa"/>
               <w:start w:w="130" w:type="dxa"/>
@@ -96,7 +96,7 @@
         <w:tc>
           <w:tcPr>
             <w:tcW w:type="dxa" w:w="10080"/>
-            <w:shd w:fill="EEF4F7"/>
+            <w:shd w:fill="EEF4F7" w:val="clear"/>
             <w:tcMar>
               <w:top w:w="150" w:type="dxa"/>
               <w:start w:w="180" w:type="dxa"/>
@@ -156,7 +156,7 @@
         <w:tc>
           <w:tcPr>
             <w:tcW w:type="dxa" w:w="10080"/>
-            <w:shd w:fill="315C8C"/>
+            <w:shd w:fill="315C8C" w:val="clear"/>
             <w:tcMar>
               <w:top w:w="70" w:type="dxa"/>
               <w:start w:w="130" w:type="dxa"/>
@@ -207,7 +207,7 @@
         <w:tc>
           <w:tcPr>
             <w:tcW w:type="dxa" w:w="10080"/>
-            <w:shd w:fill="EAF0F5"/>
+            <w:shd w:fill="EAF0F5" w:val="clear"/>
             <w:tcMar>
               <w:top w:w="150" w:type="dxa"/>
               <w:start w:w="180" w:type="dxa"/>
@@ -268,7 +268,7 @@
         <w:tc>
           <w:tcPr>
             <w:tcW w:type="dxa" w:w="792"/>
-            <w:shd w:fill="132238"/>
+            <w:shd w:fill="132238" w:val="clear"/>
             <w:tcMar>
               <w:top w:w="90" w:type="dxa"/>
               <w:start w:w="110" w:type="dxa"/>
@@ -295,7 +295,7 @@
         <w:tc>
           <w:tcPr>
             <w:tcW w:type="dxa" w:w="2376"/>
-            <w:shd w:fill="132238"/>
+            <w:shd w:fill="132238" w:val="clear"/>
             <w:tcMar>
               <w:top w:w="90" w:type="dxa"/>
               <w:start w:w="110" w:type="dxa"/>
@@ -322,7 +322,7 @@
         <w:tc>
           <w:tcPr>
             <w:tcW w:type="dxa" w:w="7128"/>
-            <w:shd w:fill="132238"/>
+            <w:shd w:fill="132238" w:val="clear"/>
             <w:tcMar>
               <w:top w:w="90" w:type="dxa"/>
               <w:start w:w="110" w:type="dxa"/>
@@ -1290,7 +1290,7 @@
         <w:tc>
           <w:tcPr>
             <w:tcW w:type="dxa" w:w="10080"/>
-            <w:shd w:fill="EAF0F5"/>
+            <w:shd w:fill="EAF0F5" w:val="clear"/>
             <w:tcMar>
               <w:top w:w="150" w:type="dxa"/>
               <w:start w:w="180" w:type="dxa"/>
@@ -1342,7 +1342,7 @@
         <w:tc>
           <w:tcPr>
             <w:tcW w:type="dxa" w:w="10080"/>
-            <w:shd w:fill="315C8C"/>
+            <w:shd w:fill="315C8C" w:val="clear"/>
             <w:tcMar>
               <w:top w:w="70" w:type="dxa"/>
               <w:start w:w="130" w:type="dxa"/>
@@ -1399,7 +1399,7 @@
         <w:tc>
           <w:tcPr>
             <w:tcW w:type="dxa" w:w="1800"/>
-            <w:shd w:fill="132238"/>
+            <w:shd w:fill="132238" w:val="clear"/>
             <w:tcMar>
               <w:top w:w="90" w:type="dxa"/>
               <w:start w:w="110" w:type="dxa"/>
@@ -1426,7 +1426,7 @@
         <w:tc>
           <w:tcPr>
             <w:tcW w:type="dxa" w:w="2520"/>
-            <w:shd w:fill="132238"/>
+            <w:shd w:fill="132238" w:val="clear"/>
             <w:tcMar>
               <w:top w:w="90" w:type="dxa"/>
               <w:start w:w="110" w:type="dxa"/>
@@ -1453,7 +1453,7 @@
         <w:tc>
           <w:tcPr>
             <w:tcW w:type="dxa" w:w="5976"/>
-            <w:shd w:fill="132238"/>
+            <w:shd w:fill="132238" w:val="clear"/>
             <w:tcMar>
               <w:top w:w="90" w:type="dxa"/>
               <w:start w:w="110" w:type="dxa"/>
@@ -2066,7 +2066,7 @@
         <w:tc>
           <w:tcPr>
             <w:tcW w:type="dxa" w:w="10080"/>
-            <w:shd w:fill="EAF0F5"/>
+            <w:shd w:fill="EAF0F5" w:val="clear"/>
             <w:tcMar>
               <w:top w:w="150" w:type="dxa"/>
               <w:start w:w="180" w:type="dxa"/>
@@ -2204,7 +2204,7 @@
         <w:tc>
           <w:tcPr>
             <w:tcW w:type="dxa" w:w="10080"/>
-            <w:shd w:fill="315C8C"/>
+            <w:shd w:fill="315C8C" w:val="clear"/>
             <w:tcMar>
               <w:top w:w="70" w:type="dxa"/>
               <w:start w:w="130" w:type="dxa"/>
@@ -2401,7 +2401,7 @@
         <w:tc>
           <w:tcPr>
             <w:tcW w:type="dxa" w:w="10080"/>
-            <w:shd w:fill="EAF0F5"/>
+            <w:shd w:fill="EAF0F5" w:val="clear"/>
             <w:tcMar>
               <w:top w:w="150" w:type="dxa"/>
               <w:start w:w="180" w:type="dxa"/>
@@ -2454,7 +2454,7 @@
         <w:tc>
           <w:tcPr>
             <w:tcW w:type="dxa" w:w="1440"/>
-            <w:shd w:fill="132238"/>
+            <w:shd w:fill="132238" w:val="clear"/>
             <w:tcMar>
               <w:top w:w="90" w:type="dxa"/>
               <w:start w:w="110" w:type="dxa"/>
@@ -2481,7 +2481,7 @@
         <w:tc>
           <w:tcPr>
             <w:tcW w:type="dxa" w:w="4320"/>
-            <w:shd w:fill="132238"/>
+            <w:shd w:fill="132238" w:val="clear"/>
             <w:tcMar>
               <w:top w:w="90" w:type="dxa"/>
               <w:start w:w="110" w:type="dxa"/>
@@ -2508,7 +2508,7 @@
         <w:tc>
           <w:tcPr>
             <w:tcW w:type="dxa" w:w="4464"/>
-            <w:shd w:fill="132238"/>
+            <w:shd w:fill="132238" w:val="clear"/>
             <w:tcMar>
               <w:top w:w="90" w:type="dxa"/>
               <w:start w:w="110" w:type="dxa"/>
@@ -2960,7 +2960,7 @@
         <w:tc>
           <w:tcPr>
             <w:tcW w:type="dxa" w:w="10080"/>
-            <w:shd w:fill="315C8C"/>
+            <w:shd w:fill="315C8C" w:val="clear"/>
             <w:tcMar>
               <w:top w:w="70" w:type="dxa"/>
               <w:start w:w="130" w:type="dxa"/>
@@ -3025,7 +3025,7 @@
         <w:tc>
           <w:tcPr>
             <w:tcW w:type="dxa" w:w="1800"/>
-            <w:shd w:fill="132238"/>
+            <w:shd w:fill="132238" w:val="clear"/>
             <w:tcMar>
               <w:top w:w="90" w:type="dxa"/>
               <w:start w:w="110" w:type="dxa"/>
@@ -3052,7 +3052,7 @@
         <w:tc>
           <w:tcPr>
             <w:tcW w:type="dxa" w:w="3528"/>
-            <w:shd w:fill="132238"/>
+            <w:shd w:fill="132238" w:val="clear"/>
             <w:tcMar>
               <w:top w:w="90" w:type="dxa"/>
               <w:start w:w="110" w:type="dxa"/>
@@ -3079,7 +3079,7 @@
         <w:tc>
           <w:tcPr>
             <w:tcW w:type="dxa" w:w="4968"/>
-            <w:shd w:fill="132238"/>
+            <w:shd w:fill="132238" w:val="clear"/>
             <w:tcMar>
               <w:top w:w="90" w:type="dxa"/>
               <w:start w:w="110" w:type="dxa"/>
@@ -3918,7 +3918,7 @@
         <w:tc>
           <w:tcPr>
             <w:tcW w:type="dxa" w:w="3024"/>
-            <w:shd w:fill="132238"/>
+            <w:shd w:fill="132238" w:val="clear"/>
             <w:tcMar>
               <w:top w:w="90" w:type="dxa"/>
               <w:start w:w="110" w:type="dxa"/>
@@ -3945,7 +3945,7 @@
         <w:tc>
           <w:tcPr>
             <w:tcW w:type="dxa" w:w="7272"/>
-            <w:shd w:fill="132238"/>
+            <w:shd w:fill="132238" w:val="clear"/>
             <w:tcMar>
               <w:top w:w="90" w:type="dxa"/>
               <w:start w:w="110" w:type="dxa"/>
@@ -4470,7 +4470,7 @@
         <w:tc>
           <w:tcPr>
             <w:tcW w:type="dxa" w:w="10080"/>
-            <w:shd w:fill="EAF0F5"/>
+            <w:shd w:fill="EAF0F5" w:val="clear"/>
             <w:tcMar>
               <w:top w:w="150" w:type="dxa"/>
               <w:start w:w="180" w:type="dxa"/>
@@ -4582,7 +4582,7 @@
         <w:tc>
           <w:tcPr>
             <w:tcW w:type="dxa" w:w="10080"/>
-            <w:shd w:fill="315C8C"/>
+            <w:shd w:fill="315C8C" w:val="clear"/>
             <w:tcMar>
               <w:top w:w="70" w:type="dxa"/>
               <w:start w:w="130" w:type="dxa"/>
@@ -4745,7 +4745,7 @@
         <w:tc>
           <w:tcPr>
             <w:tcW w:type="dxa" w:w="1944"/>
-            <w:shd w:fill="132238"/>
+            <w:shd w:fill="132238" w:val="clear"/>
             <w:tcMar>
               <w:top w:w="90" w:type="dxa"/>
               <w:start w:w="110" w:type="dxa"/>
@@ -4772,7 +4772,7 @@
         <w:tc>
           <w:tcPr>
             <w:tcW w:type="dxa" w:w="8352"/>
-            <w:shd w:fill="132238"/>
+            <w:shd w:fill="132238" w:val="clear"/>
             <w:tcMar>
               <w:top w:w="90" w:type="dxa"/>
               <w:start w:w="110" w:type="dxa"/>
@@ -5153,7 +5153,7 @@
         <w:tc>
           <w:tcPr>
             <w:tcW w:type="dxa" w:w="10080"/>
-            <w:shd w:fill="EAF0F5"/>
+            <w:shd w:fill="EAF0F5" w:val="clear"/>
             <w:tcMar>
               <w:top w:w="150" w:type="dxa"/>
               <w:start w:w="180" w:type="dxa"/>
@@ -5205,7 +5205,7 @@
         <w:tc>
           <w:tcPr>
             <w:tcW w:type="dxa" w:w="10080"/>
-            <w:shd w:fill="315C8C"/>
+            <w:shd w:fill="315C8C" w:val="clear"/>
             <w:tcMar>
               <w:top w:w="70" w:type="dxa"/>
               <w:start w:w="130" w:type="dxa"/>
@@ -5362,7 +5362,7 @@
         <w:tc>
           <w:tcPr>
             <w:tcW w:type="dxa" w:w="1944"/>
-            <w:shd w:fill="132238"/>
+            <w:shd w:fill="132238" w:val="clear"/>
             <w:tcMar>
               <w:top w:w="90" w:type="dxa"/>
               <w:start w:w="110" w:type="dxa"/>
@@ -5389,7 +5389,7 @@
         <w:tc>
           <w:tcPr>
             <w:tcW w:type="dxa" w:w="8352"/>
-            <w:shd w:fill="132238"/>
+            <w:shd w:fill="132238" w:val="clear"/>
             <w:tcMar>
               <w:top w:w="90" w:type="dxa"/>
               <w:start w:w="110" w:type="dxa"/>
@@ -5909,7 +5909,7 @@
         <w:tc>
           <w:tcPr>
             <w:tcW w:type="dxa" w:w="10080"/>
-            <w:shd w:fill="315C8C"/>
+            <w:shd w:fill="315C8C" w:val="clear"/>
             <w:tcMar>
               <w:top w:w="70" w:type="dxa"/>
               <w:start w:w="130" w:type="dxa"/>
@@ -6048,7 +6048,7 @@
         <w:tc>
           <w:tcPr>
             <w:tcW w:type="dxa" w:w="10080"/>
-            <w:shd w:fill="EAF0F5"/>
+            <w:shd w:fill="EAF0F5" w:val="clear"/>
             <w:tcMar>
               <w:top w:w="150" w:type="dxa"/>
               <w:start w:w="180" w:type="dxa"/>
@@ -6101,7 +6101,7 @@
         <w:tc>
           <w:tcPr>
             <w:tcW w:type="dxa" w:w="2304"/>
-            <w:shd w:fill="132238"/>
+            <w:shd w:fill="132238" w:val="clear"/>
             <w:tcMar>
               <w:top w:w="90" w:type="dxa"/>
               <w:start w:w="110" w:type="dxa"/>
@@ -6128,7 +6128,7 @@
         <w:tc>
           <w:tcPr>
             <w:tcW w:type="dxa" w:w="3744"/>
-            <w:shd w:fill="132238"/>
+            <w:shd w:fill="132238" w:val="clear"/>
             <w:tcMar>
               <w:top w:w="90" w:type="dxa"/>
               <w:start w:w="110" w:type="dxa"/>
@@ -6155,7 +6155,7 @@
         <w:tc>
           <w:tcPr>
             <w:tcW w:type="dxa" w:w="4248"/>
-            <w:shd w:fill="132238"/>
+            <w:shd w:fill="132238" w:val="clear"/>
             <w:tcMar>
               <w:top w:w="90" w:type="dxa"/>
               <w:start w:w="110" w:type="dxa"/>
@@ -6691,7 +6691,7 @@
         <w:tc>
           <w:tcPr>
             <w:tcW w:type="dxa" w:w="10080"/>
-            <w:shd w:fill="315C8C"/>
+            <w:shd w:fill="315C8C" w:val="clear"/>
             <w:tcMar>
               <w:top w:w="70" w:type="dxa"/>
               <w:start w:w="130" w:type="dxa"/>
@@ -6862,7 +6862,7 @@
         <w:tc>
           <w:tcPr>
             <w:tcW w:type="dxa" w:w="10080"/>
-            <w:shd w:fill="EAF0F5"/>
+            <w:shd w:fill="EAF0F5" w:val="clear"/>
             <w:tcMar>
               <w:top w:w="150" w:type="dxa"/>
               <w:start w:w="180" w:type="dxa"/>
@@ -6974,7 +6974,7 @@
         <w:tc>
           <w:tcPr>
             <w:tcW w:type="dxa" w:w="10080"/>
-            <w:shd w:fill="315C8C"/>
+            <w:shd w:fill="315C8C" w:val="clear"/>
             <w:tcMar>
               <w:top w:w="70" w:type="dxa"/>
               <w:start w:w="130" w:type="dxa"/>
@@ -7100,7 +7100,7 @@
         <w:tc>
           <w:tcPr>
             <w:tcW w:type="dxa" w:w="2520"/>
-            <w:shd w:fill="132238"/>
+            <w:shd w:fill="132238" w:val="clear"/>
             <w:tcMar>
               <w:top w:w="90" w:type="dxa"/>
               <w:start w:w="110" w:type="dxa"/>
@@ -7127,7 +7127,7 @@
         <w:tc>
           <w:tcPr>
             <w:tcW w:type="dxa" w:w="7776"/>
-            <w:shd w:fill="132238"/>
+            <w:shd w:fill="132238" w:val="clear"/>
             <w:tcMar>
               <w:top w:w="90" w:type="dxa"/>
               <w:start w:w="110" w:type="dxa"/>
@@ -7604,7 +7604,7 @@
         <w:tc>
           <w:tcPr>
             <w:tcW w:type="dxa" w:w="10080"/>
-            <w:shd w:fill="EAF0F5"/>
+            <w:shd w:fill="EAF0F5" w:val="clear"/>
             <w:tcMar>
               <w:top w:w="150" w:type="dxa"/>
               <w:start w:w="180" w:type="dxa"/>
@@ -7656,7 +7656,7 @@
         <w:tc>
           <w:tcPr>
             <w:tcW w:type="dxa" w:w="10080"/>
-            <w:shd w:fill="315C8C"/>
+            <w:shd w:fill="315C8C" w:val="clear"/>
             <w:tcMar>
               <w:top w:w="70" w:type="dxa"/>
               <w:start w:w="130" w:type="dxa"/>
@@ -7720,7 +7720,7 @@
         <w:tc>
           <w:tcPr>
             <w:tcW w:type="dxa" w:w="1800"/>
-            <w:shd w:fill="132238"/>
+            <w:shd w:fill="132238" w:val="clear"/>
             <w:tcMar>
               <w:top w:w="90" w:type="dxa"/>
               <w:start w:w="110" w:type="dxa"/>
@@ -7747,7 +7747,7 @@
         <w:tc>
           <w:tcPr>
             <w:tcW w:type="dxa" w:w="8496"/>
-            <w:shd w:fill="132238"/>
+            <w:shd w:fill="132238" w:val="clear"/>
             <w:tcMar>
               <w:top w:w="90" w:type="dxa"/>
               <w:start w:w="110" w:type="dxa"/>
@@ -8418,7 +8418,7 @@
         <w:tc>
           <w:tcPr>
             <w:tcW w:type="dxa" w:w="10080"/>
-            <w:shd w:fill="315C8C"/>
+            <w:shd w:fill="315C8C" w:val="clear"/>
             <w:tcMar>
               <w:top w:w="70" w:type="dxa"/>
               <w:start w:w="130" w:type="dxa"/>
@@ -8558,7 +8558,7 @@
         <w:tc>
           <w:tcPr>
             <w:tcW w:type="dxa" w:w="10080"/>
-            <w:shd w:fill="EAF0F5"/>
+            <w:shd w:fill="EAF0F5" w:val="clear"/>
             <w:tcMar>
               <w:top w:w="150" w:type="dxa"/>
               <w:start w:w="180" w:type="dxa"/>
@@ -8610,7 +8610,7 @@
         <w:tc>
           <w:tcPr>
             <w:tcW w:type="dxa" w:w="10080"/>
-            <w:shd w:fill="315C8C"/>
+            <w:shd w:fill="315C8C" w:val="clear"/>
             <w:tcMar>
               <w:top w:w="70" w:type="dxa"/>
               <w:start w:w="130" w:type="dxa"/>
@@ -8669,7 +8669,7 @@
         <w:tc>
           <w:tcPr>
             <w:tcW w:type="dxa" w:w="3384"/>
-            <w:shd w:fill="132238"/>
+            <w:shd w:fill="132238" w:val="clear"/>
             <w:tcMar>
               <w:top w:w="90" w:type="dxa"/>
               <w:start w:w="110" w:type="dxa"/>
@@ -8696,7 +8696,7 @@
         <w:tc>
           <w:tcPr>
             <w:tcW w:type="dxa" w:w="6912"/>
-            <w:shd w:fill="132238"/>
+            <w:shd w:fill="132238" w:val="clear"/>
             <w:tcMar>
               <w:top w:w="90" w:type="dxa"/>
               <w:start w:w="110" w:type="dxa"/>
@@ -9333,7 +9333,7 @@
         <w:tc>
           <w:tcPr>
             <w:tcW w:type="dxa" w:w="10080"/>
-            <w:shd w:fill="EAF0F5"/>
+            <w:shd w:fill="EAF0F5" w:val="clear"/>
             <w:tcMar>
               <w:top w:w="150" w:type="dxa"/>
               <w:start w:w="180" w:type="dxa"/>
@@ -9385,7 +9385,7 @@
         <w:tc>
           <w:tcPr>
             <w:tcW w:type="dxa" w:w="10080"/>
-            <w:shd w:fill="315C8C"/>
+            <w:shd w:fill="315C8C" w:val="clear"/>
             <w:tcMar>
               <w:top w:w="70" w:type="dxa"/>
               <w:start w:w="130" w:type="dxa"/>
@@ -9602,7 +9602,7 @@
         <w:tc>
           <w:tcPr>
             <w:tcW w:type="dxa" w:w="10080"/>
-            <w:shd w:fill="315C8C"/>
+            <w:shd w:fill="315C8C" w:val="clear"/>
             <w:tcMar>
               <w:top w:w="70" w:type="dxa"/>
               <w:start w:w="130" w:type="dxa"/>
@@ -9734,7 +9734,7 @@
         <w:tc>
           <w:tcPr>
             <w:tcW w:type="dxa" w:w="1944"/>
-            <w:shd w:fill="132238"/>
+            <w:shd w:fill="132238" w:val="clear"/>
             <w:tcMar>
               <w:top w:w="90" w:type="dxa"/>
               <w:start w:w="110" w:type="dxa"/>
@@ -9761,7 +9761,7 @@
         <w:tc>
           <w:tcPr>
             <w:tcW w:type="dxa" w:w="8352"/>
-            <w:shd w:fill="132238"/>
+            <w:shd w:fill="132238" w:val="clear"/>
             <w:tcMar>
               <w:top w:w="90" w:type="dxa"/>
               <w:start w:w="110" w:type="dxa"/>
@@ -10218,7 +10218,7 @@
         <w:tc>
           <w:tcPr>
             <w:tcW w:type="dxa" w:w="10080"/>
-            <w:shd w:fill="315C8C"/>
+            <w:shd w:fill="315C8C" w:val="clear"/>
             <w:tcMar>
               <w:top w:w="70" w:type="dxa"/>
               <w:start w:w="130" w:type="dxa"/>
@@ -10410,7 +10410,7 @@
         <w:tc>
           <w:tcPr>
             <w:tcW w:type="dxa" w:w="10080"/>
-            <w:shd w:fill="EAF0F5"/>
+            <w:shd w:fill="EAF0F5" w:val="clear"/>
             <w:tcMar>
               <w:top w:w="150" w:type="dxa"/>
               <w:start w:w="180" w:type="dxa"/>
@@ -10462,7 +10462,7 @@
         <w:tc>
           <w:tcPr>
             <w:tcW w:type="dxa" w:w="10080"/>
-            <w:shd w:fill="315C8C"/>
+            <w:shd w:fill="315C8C" w:val="clear"/>
             <w:tcMar>
               <w:top w:w="70" w:type="dxa"/>
               <w:start w:w="130" w:type="dxa"/>
@@ -10514,7 +10514,7 @@
         <w:tc>
           <w:tcPr>
             <w:tcW w:type="dxa" w:w="576"/>
-            <w:shd w:fill="132238"/>
+            <w:shd w:fill="132238" w:val="clear"/>
             <w:tcMar>
               <w:top w:w="90" w:type="dxa"/>
               <w:start w:w="110" w:type="dxa"/>
@@ -10541,7 +10541,7 @@
         <w:tc>
           <w:tcPr>
             <w:tcW w:type="dxa" w:w="3384"/>
-            <w:shd w:fill="132238"/>
+            <w:shd w:fill="132238" w:val="clear"/>
             <w:tcMar>
               <w:top w:w="90" w:type="dxa"/>
               <w:start w:w="110" w:type="dxa"/>
@@ -10568,7 +10568,7 @@
         <w:tc>
           <w:tcPr>
             <w:tcW w:type="dxa" w:w="6336"/>
-            <w:shd w:fill="132238"/>
+            <w:shd w:fill="132238" w:val="clear"/>
             <w:tcMar>
               <w:top w:w="90" w:type="dxa"/>
               <w:start w:w="110" w:type="dxa"/>
@@ -12038,7 +12038,7 @@
         <w:tc>
           <w:tcPr>
             <w:tcW w:type="dxa" w:w="10080"/>
-            <w:shd w:fill="315C8C"/>
+            <w:shd w:fill="315C8C" w:val="clear"/>
             <w:tcMar>
               <w:top w:w="70" w:type="dxa"/>
               <w:start w:w="130" w:type="dxa"/>
@@ -12089,7 +12089,7 @@
         <w:tc>
           <w:tcPr>
             <w:tcW w:type="dxa" w:w="3024"/>
-            <w:shd w:fill="132238"/>
+            <w:shd w:fill="132238" w:val="clear"/>
             <w:tcMar>
               <w:top w:w="90" w:type="dxa"/>
               <w:start w:w="110" w:type="dxa"/>
@@ -12116,7 +12116,7 @@
         <w:tc>
           <w:tcPr>
             <w:tcW w:type="dxa" w:w="7272"/>
-            <w:shd w:fill="132238"/>
+            <w:shd w:fill="132238" w:val="clear"/>
             <w:tcMar>
               <w:top w:w="90" w:type="dxa"/>
               <w:start w:w="110" w:type="dxa"/>
@@ -12689,7 +12689,7 @@
         <w:tc>
           <w:tcPr>
             <w:tcW w:type="dxa" w:w="10080"/>
-            <w:shd w:fill="EAF0F5"/>
+            <w:shd w:fill="EAF0F5" w:val="clear"/>
             <w:tcMar>
               <w:top w:w="150" w:type="dxa"/>
               <w:start w:w="180" w:type="dxa"/>
@@ -12741,7 +12741,7 @@
         <w:tc>
           <w:tcPr>
             <w:tcW w:type="dxa" w:w="10080"/>
-            <w:shd w:fill="315C8C"/>
+            <w:shd w:fill="315C8C" w:val="clear"/>
             <w:tcMar>
               <w:top w:w="70" w:type="dxa"/>
               <w:start w:w="130" w:type="dxa"/>
@@ -12995,7 +12995,7 @@
         <w:tc>
           <w:tcPr>
             <w:tcW w:type="dxa" w:w="10080"/>
-            <w:shd w:fill="EEF4F7"/>
+            <w:shd w:fill="EEF4F7" w:val="clear"/>
             <w:tcMar>
               <w:top w:w="150" w:type="dxa"/>
               <w:start w:w="180" w:type="dxa"/>
@@ -13047,7 +13047,7 @@
         <w:tc>
           <w:tcPr>
             <w:tcW w:type="dxa" w:w="10080"/>
-            <w:shd w:fill="132238"/>
+            <w:shd w:fill="132238" w:val="clear"/>
             <w:tcMar>
               <w:top w:w="70" w:type="dxa"/>
               <w:start w:w="130" w:type="dxa"/>
@@ -13099,7 +13099,7 @@
         <w:tc>
           <w:tcPr>
             <w:tcW w:type="dxa" w:w="2448"/>
-            <w:shd w:fill="132238"/>
+            <w:shd w:fill="132238" w:val="clear"/>
             <w:tcMar>
               <w:top w:w="90" w:type="dxa"/>
               <w:start w:w="110" w:type="dxa"/>
@@ -13126,7 +13126,7 @@
         <w:tc>
           <w:tcPr>
             <w:tcW w:type="dxa" w:w="4824"/>
-            <w:shd w:fill="132238"/>
+            <w:shd w:fill="132238" w:val="clear"/>
             <w:tcMar>
               <w:top w:w="90" w:type="dxa"/>
               <w:start w:w="110" w:type="dxa"/>
@@ -13153,7 +13153,7 @@
         <w:tc>
           <w:tcPr>
             <w:tcW w:type="dxa" w:w="3024"/>
-            <w:shd w:fill="132238"/>
+            <w:shd w:fill="132238" w:val="clear"/>
             <w:tcMar>
               <w:top w:w="90" w:type="dxa"/>
               <w:start w:w="110" w:type="dxa"/>

</xml_diff>